<commit_message>
publishing Mod 9 EDI
</commit_message>
<xml_diff>
--- a/EDI_Publishing/Macrosystems_EDDIE_Module_9_HighFrequencyData/Editable_versions_all_files/Instructor_Manual_Module9.docx
+++ b/EDI_Publishing/Macrosystems_EDDIE_Module_9_HighFrequencyData/Editable_versions_all_files/Instructor_Manual_Module9.docx
@@ -1,6 +1,6 @@
 
 <file path=word/document.xml><?xml version="1.0" encoding="utf-8"?>
-<w:document xmlns:wpc="http://schemas.microsoft.com/office/word/2010/wordprocessingCanvas" xmlns:cx="http://schemas.microsoft.com/office/drawing/2014/chartex" xmlns:cx1="http://schemas.microsoft.com/office/drawing/2015/9/8/chartex" xmlns:cx2="http://schemas.microsoft.com/office/drawing/2015/10/21/chartex" xmlns:cx3="http://schemas.microsoft.com/office/drawing/2016/5/9/chartex" xmlns:cx4="http://schemas.microsoft.com/office/drawing/2016/5/10/chartex" xmlns:cx5="http://schemas.microsoft.com/office/drawing/2016/5/11/chartex" xmlns:cx6="http://schemas.microsoft.com/office/drawing/2016/5/12/chartex" xmlns:cx7="http://schemas.microsoft.com/office/drawing/2016/5/13/chartex" xmlns:cx8="http://schemas.microsoft.com/office/drawing/2016/5/14/chartex" xmlns:mc="http://schemas.openxmlformats.org/markup-compatibility/2006" xmlns:aink="http://schemas.microsoft.com/office/drawing/2016/ink" xmlns:am3d="http://schemas.microsoft.com/office/drawing/2017/model3d" xmlns:o="urn:schemas-microsoft-com:office:office" xmlns:oel="http://schemas.microsoft.com/office/2019/extlst" xmlns:r="http://schemas.openxmlformats.org/officeDocument/2006/relationships" xmlns:m="http://schemas.openxmlformats.org/officeDocument/2006/math" xmlns:v="urn:schemas-microsoft-com:vml" xmlns:wp14="http://schemas.microsoft.com/office/word/2010/wordprocessingDrawing" xmlns:wp="http://schemas.openxmlformats.org/drawingml/2006/wordprocessingDrawing" xmlns:w10="urn:schemas-microsoft-com:office:word" xmlns:w="http://schemas.openxmlformats.org/wordprocessingml/2006/main" xmlns:w14="http://schemas.microsoft.com/office/word/2010/wordml" xmlns:w15="http://schemas.microsoft.com/office/word/2012/wordml" xmlns:w16cex="http://schemas.microsoft.com/office/word/2018/wordml/cex" xmlns:w16cid="http://schemas.microsoft.com/office/word/2016/wordml/cid" xmlns:w16="http://schemas.microsoft.com/office/word/2018/wordml" xmlns:w16du="http://schemas.microsoft.com/office/word/2023/wordml/word16du" xmlns:w16sdtdh="http://schemas.microsoft.com/office/word/2020/wordml/sdtdatahash" xmlns:w16se="http://schemas.microsoft.com/office/word/2015/wordml/symex" xmlns:wpg="http://schemas.microsoft.com/office/word/2010/wordprocessingGroup" xmlns:wpi="http://schemas.microsoft.com/office/word/2010/wordprocessingInk" xmlns:wne="http://schemas.microsoft.com/office/word/2006/wordml" xmlns:wps="http://schemas.microsoft.com/office/word/2010/wordprocessingShape" mc:Ignorable="w14 w15 w16se w16cid w16 w16cex w16sdtdh w16du wp14">
+<w:document xmlns:wpc="http://schemas.microsoft.com/office/word/2010/wordprocessingCanvas" xmlns:cx="http://schemas.microsoft.com/office/drawing/2014/chartex" xmlns:cx1="http://schemas.microsoft.com/office/drawing/2015/9/8/chartex" xmlns:cx2="http://schemas.microsoft.com/office/drawing/2015/10/21/chartex" xmlns:cx3="http://schemas.microsoft.com/office/drawing/2016/5/9/chartex" xmlns:cx4="http://schemas.microsoft.com/office/drawing/2016/5/10/chartex" xmlns:cx5="http://schemas.microsoft.com/office/drawing/2016/5/11/chartex" xmlns:cx6="http://schemas.microsoft.com/office/drawing/2016/5/12/chartex" xmlns:cx7="http://schemas.microsoft.com/office/drawing/2016/5/13/chartex" xmlns:cx8="http://schemas.microsoft.com/office/drawing/2016/5/14/chartex" xmlns:mc="http://schemas.openxmlformats.org/markup-compatibility/2006" xmlns:aink="http://schemas.microsoft.com/office/drawing/2016/ink" xmlns:am3d="http://schemas.microsoft.com/office/drawing/2017/model3d" xmlns:o="urn:schemas-microsoft-com:office:office" xmlns:oel="http://schemas.microsoft.com/office/2019/extlst" xmlns:r="http://schemas.openxmlformats.org/officeDocument/2006/relationships" xmlns:m="http://schemas.openxmlformats.org/officeDocument/2006/math" xmlns:v="urn:schemas-microsoft-com:vml" xmlns:wp14="http://schemas.microsoft.com/office/word/2010/wordprocessingDrawing" xmlns:wp="http://schemas.openxmlformats.org/drawingml/2006/wordprocessingDrawing" xmlns:w10="urn:schemas-microsoft-com:office:word" xmlns:w="http://schemas.openxmlformats.org/wordprocessingml/2006/main" xmlns:w14="http://schemas.microsoft.com/office/word/2010/wordml" xmlns:w15="http://schemas.microsoft.com/office/word/2012/wordml" xmlns:w16cex="http://schemas.microsoft.com/office/word/2018/wordml/cex" xmlns:w16cid="http://schemas.microsoft.com/office/word/2016/wordml/cid" xmlns:w16="http://schemas.microsoft.com/office/word/2018/wordml" xmlns:w16du="http://schemas.microsoft.com/office/word/2023/wordml/word16du" xmlns:w16sdtdh="http://schemas.microsoft.com/office/word/2020/wordml/sdtdatahash" xmlns:w16sdtfl="http://schemas.microsoft.com/office/word/2024/wordml/sdtformatlock" xmlns:w16se="http://schemas.microsoft.com/office/word/2015/wordml/symex" xmlns:wpg="http://schemas.microsoft.com/office/word/2010/wordprocessingGroup" xmlns:wpi="http://schemas.microsoft.com/office/word/2010/wordprocessingInk" xmlns:wne="http://schemas.microsoft.com/office/word/2006/wordml" xmlns:wps="http://schemas.microsoft.com/office/word/2010/wordprocessingShape" mc:Ignorable="w14 w15 w16se w16cid w16 w16cex w16sdtdh w16sdtfl w16du wp14">
   <w:body>
     <w:p/>
     <w:p>
@@ -673,6 +673,7 @@
         <w:pStyle w:val="Heading1"/>
       </w:pPr>
       <w:r>
+        <w:lastRenderedPageBreak/>
         <w:br w:type="page"/>
       </w:r>
     </w:p>
@@ -711,7 +712,7 @@
         </w:numPr>
       </w:pPr>
       <w:r>
-        <w:t>Explain how water temperature changes over the course of a year in a temperate reservoir and how these changes affect water quality. (Activity A, Activity B)</w:t>
+        <w:t>Explain how water temperature changes over a year in a temperate reservoir and how these changes affect water quality. (Activity A, Activity B)</w:t>
       </w:r>
     </w:p>
     <w:p>
@@ -1373,25 +1374,7 @@
           <w:color w:val="000000" w:themeColor="text1"/>
           <w:lang w:eastAsia="en-IE"/>
         </w:rPr>
-        <w:t xml:space="preserve">If you would like to take a break and come back later, or if you lose internet connection, all you </w:t>
-      </w:r>
-      <w:proofErr w:type="gramStart"/>
-      <w:r>
-        <w:rPr>
-          <w:rFonts w:eastAsia="Times New Roman" w:cs="Times New Roman"/>
-          <w:color w:val="000000" w:themeColor="text1"/>
-          <w:lang w:eastAsia="en-IE"/>
-        </w:rPr>
-        <w:t>have to</w:t>
-      </w:r>
-      <w:proofErr w:type="gramEnd"/>
-      <w:r>
-        <w:rPr>
-          <w:rFonts w:eastAsia="Times New Roman" w:cs="Times New Roman"/>
-          <w:color w:val="000000" w:themeColor="text1"/>
-          <w:lang w:eastAsia="en-IE"/>
-        </w:rPr>
-        <w:t xml:space="preserve"> do is re-load this web app, re-select your reservoir site in the Introduction, and you will be able to resume your progress. On Canvas, you can </w:t>
+        <w:t xml:space="preserve">If you would like to take a break and come back later, or if you lose internet connection, all you have to do is re-load this web app, re-select your reservoir site in the Introduction, and you will be able to resume your progress. On Canvas, you can </w:t>
       </w:r>
       <w:r>
         <w:rPr>
@@ -2703,15 +2686,7 @@
         </w:numPr>
       </w:pPr>
       <w:r>
-        <w:t xml:space="preserve">Carey, C. C., R. D. </w:t>
-      </w:r>
-      <w:proofErr w:type="spellStart"/>
-      <w:r>
-        <w:t>Gougis</w:t>
-      </w:r>
-      <w:proofErr w:type="spellEnd"/>
-      <w:r>
-        <w:t>, J. L. Klug, C. M. O’Reilly, and D. C. Richardson. 2015. A model for using environmental data-driven inquiry and exploration to teach limnology to undergraduates. Limnology and Oceanography Bulletin 24:32–35.</w:t>
+        <w:t>Carey, C. C., R. D. Gougis, J. L. Klug, C. M. O’Reilly, and D. C. Richardson. 2015. A model for using environmental data-driven inquiry and exploration to teach limnology to undergraduates. Limnology and Oceanography Bulletin 24:32–35.</w:t>
       </w:r>
     </w:p>
     <w:p>
@@ -2723,15 +2698,7 @@
         </w:numPr>
       </w:pPr>
       <w:r>
-        <w:t xml:space="preserve">Carey, C. C., and R. D. </w:t>
-      </w:r>
-      <w:proofErr w:type="spellStart"/>
-      <w:r>
-        <w:t>Gougis</w:t>
-      </w:r>
-      <w:proofErr w:type="spellEnd"/>
-      <w:r>
-        <w:t xml:space="preserve">. 2017. Simulation </w:t>
+        <w:t xml:space="preserve">Carey, C. C., and R. D. Gougis. 2017. Simulation </w:t>
       </w:r>
       <w:r>
         <w:t>m</w:t>
@@ -2818,15 +2785,7 @@
         </w:numPr>
       </w:pPr>
       <w:r>
-        <w:t xml:space="preserve">Klug, J. L., C. C. Carey, D. C. Richardson, and R. Darner </w:t>
-      </w:r>
-      <w:proofErr w:type="spellStart"/>
-      <w:r>
-        <w:t>Gougis</w:t>
-      </w:r>
-      <w:proofErr w:type="spellEnd"/>
-      <w:r>
-        <w:t xml:space="preserve">. 2017. Analysis of high-frequency and long-term data in undergraduate ecology classes improves quantitative literacy. Ecosphere </w:t>
+        <w:t xml:space="preserve">Klug, J. L., C. C. Carey, D. C. Richardson, and R. Darner Gougis. 2017. Analysis of high-frequency and long-term data in undergraduate ecology classes improves quantitative literacy. Ecosphere </w:t>
       </w:r>
       <w:proofErr w:type="gramStart"/>
       <w:r>
@@ -2872,15 +2831,7 @@
         </w:numPr>
       </w:pPr>
       <w:r>
-        <w:t xml:space="preserve">Carey, C. C., Farrell, K. J., </w:t>
-      </w:r>
-      <w:proofErr w:type="spellStart"/>
-      <w:r>
-        <w:t>Hounshell</w:t>
-      </w:r>
-      <w:proofErr w:type="spellEnd"/>
-      <w:r>
-        <w:t>, A. G., &amp; O'Connell, K. 2020. Macrosystems EDDIE teaching modules significantly increase ecology students' proficiency and confidence working with ecosystem models and use of systems thinking</w:t>
+        <w:t>Carey, C. C., Farrell, K. J., Hounshell, A. G., &amp; O'Connell, K. 2020. Macrosystems EDDIE teaching modules significantly increase ecology students' proficiency and confidence working with ecosystem models and use of systems thinking</w:t>
       </w:r>
       <w:r>
         <w:rPr>
@@ -3086,7 +3037,27 @@
           <w:sz w:val="22"/>
           <w:szCs w:val="22"/>
         </w:rPr>
-        <w:t xml:space="preserve"> forecasting improves student and instructor confidence in their data  science skills. </w:t>
+        <w:t xml:space="preserve"> forecasting improves student and instructor confidence in their </w:t>
+      </w:r>
+      <w:proofErr w:type="gramStart"/>
+      <w:r>
+        <w:rPr>
+          <w:rFonts w:ascii="Arial" w:hAnsi="Arial" w:cs="Arial"/>
+          <w:color w:val="000000"/>
+          <w:sz w:val="22"/>
+          <w:szCs w:val="22"/>
+        </w:rPr>
+        <w:t>data  science</w:t>
+      </w:r>
+      <w:proofErr w:type="gramEnd"/>
+      <w:r>
+        <w:rPr>
+          <w:rFonts w:ascii="Arial" w:hAnsi="Arial" w:cs="Arial"/>
+          <w:color w:val="000000"/>
+          <w:sz w:val="22"/>
+          <w:szCs w:val="22"/>
+        </w:rPr>
+        <w:t xml:space="preserve"> skills. </w:t>
       </w:r>
       <w:r>
         <w:rPr>
@@ -11310,7 +11281,7 @@
 </file>
 
 <file path=word/endnotes.xml><?xml version="1.0" encoding="utf-8"?>
-<w:endnotes xmlns:wpc="http://schemas.microsoft.com/office/word/2010/wordprocessingCanvas" xmlns:cx="http://schemas.microsoft.com/office/drawing/2014/chartex" xmlns:cx1="http://schemas.microsoft.com/office/drawing/2015/9/8/chartex" xmlns:cx2="http://schemas.microsoft.com/office/drawing/2015/10/21/chartex" xmlns:cx3="http://schemas.microsoft.com/office/drawing/2016/5/9/chartex" xmlns:cx4="http://schemas.microsoft.com/office/drawing/2016/5/10/chartex" xmlns:cx5="http://schemas.microsoft.com/office/drawing/2016/5/11/chartex" xmlns:cx6="http://schemas.microsoft.com/office/drawing/2016/5/12/chartex" xmlns:cx7="http://schemas.microsoft.com/office/drawing/2016/5/13/chartex" xmlns:cx8="http://schemas.microsoft.com/office/drawing/2016/5/14/chartex" xmlns:mc="http://schemas.openxmlformats.org/markup-compatibility/2006" xmlns:aink="http://schemas.microsoft.com/office/drawing/2016/ink" xmlns:am3d="http://schemas.microsoft.com/office/drawing/2017/model3d" xmlns:o="urn:schemas-microsoft-com:office:office" xmlns:oel="http://schemas.microsoft.com/office/2019/extlst" xmlns:r="http://schemas.openxmlformats.org/officeDocument/2006/relationships" xmlns:m="http://schemas.openxmlformats.org/officeDocument/2006/math" xmlns:v="urn:schemas-microsoft-com:vml" xmlns:wp14="http://schemas.microsoft.com/office/word/2010/wordprocessingDrawing" xmlns:wp="http://schemas.openxmlformats.org/drawingml/2006/wordprocessingDrawing" xmlns:w10="urn:schemas-microsoft-com:office:word" xmlns:w="http://schemas.openxmlformats.org/wordprocessingml/2006/main" xmlns:w14="http://schemas.microsoft.com/office/word/2010/wordml" xmlns:w15="http://schemas.microsoft.com/office/word/2012/wordml" xmlns:w16cex="http://schemas.microsoft.com/office/word/2018/wordml/cex" xmlns:w16cid="http://schemas.microsoft.com/office/word/2016/wordml/cid" xmlns:w16="http://schemas.microsoft.com/office/word/2018/wordml" xmlns:w16du="http://schemas.microsoft.com/office/word/2023/wordml/word16du" xmlns:w16sdtdh="http://schemas.microsoft.com/office/word/2020/wordml/sdtdatahash" xmlns:w16se="http://schemas.microsoft.com/office/word/2015/wordml/symex" xmlns:wpg="http://schemas.microsoft.com/office/word/2010/wordprocessingGroup" xmlns:wpi="http://schemas.microsoft.com/office/word/2010/wordprocessingInk" xmlns:wne="http://schemas.microsoft.com/office/word/2006/wordml" xmlns:wps="http://schemas.microsoft.com/office/word/2010/wordprocessingShape" mc:Ignorable="w14 w15 w16se w16cid w16 w16cex w16sdtdh w16du wp14">
+<w:endnotes xmlns:wpc="http://schemas.microsoft.com/office/word/2010/wordprocessingCanvas" xmlns:cx="http://schemas.microsoft.com/office/drawing/2014/chartex" xmlns:cx1="http://schemas.microsoft.com/office/drawing/2015/9/8/chartex" xmlns:cx2="http://schemas.microsoft.com/office/drawing/2015/10/21/chartex" xmlns:cx3="http://schemas.microsoft.com/office/drawing/2016/5/9/chartex" xmlns:cx4="http://schemas.microsoft.com/office/drawing/2016/5/10/chartex" xmlns:cx5="http://schemas.microsoft.com/office/drawing/2016/5/11/chartex" xmlns:cx6="http://schemas.microsoft.com/office/drawing/2016/5/12/chartex" xmlns:cx7="http://schemas.microsoft.com/office/drawing/2016/5/13/chartex" xmlns:cx8="http://schemas.microsoft.com/office/drawing/2016/5/14/chartex" xmlns:mc="http://schemas.openxmlformats.org/markup-compatibility/2006" xmlns:aink="http://schemas.microsoft.com/office/drawing/2016/ink" xmlns:am3d="http://schemas.microsoft.com/office/drawing/2017/model3d" xmlns:o="urn:schemas-microsoft-com:office:office" xmlns:oel="http://schemas.microsoft.com/office/2019/extlst" xmlns:r="http://schemas.openxmlformats.org/officeDocument/2006/relationships" xmlns:m="http://schemas.openxmlformats.org/officeDocument/2006/math" xmlns:v="urn:schemas-microsoft-com:vml" xmlns:wp14="http://schemas.microsoft.com/office/word/2010/wordprocessingDrawing" xmlns:wp="http://schemas.openxmlformats.org/drawingml/2006/wordprocessingDrawing" xmlns:w10="urn:schemas-microsoft-com:office:word" xmlns:w="http://schemas.openxmlformats.org/wordprocessingml/2006/main" xmlns:w14="http://schemas.microsoft.com/office/word/2010/wordml" xmlns:w15="http://schemas.microsoft.com/office/word/2012/wordml" xmlns:w16cex="http://schemas.microsoft.com/office/word/2018/wordml/cex" xmlns:w16cid="http://schemas.microsoft.com/office/word/2016/wordml/cid" xmlns:w16="http://schemas.microsoft.com/office/word/2018/wordml" xmlns:w16du="http://schemas.microsoft.com/office/word/2023/wordml/word16du" xmlns:w16sdtdh="http://schemas.microsoft.com/office/word/2020/wordml/sdtdatahash" xmlns:w16sdtfl="http://schemas.microsoft.com/office/word/2024/wordml/sdtformatlock" xmlns:w16se="http://schemas.microsoft.com/office/word/2015/wordml/symex" xmlns:wpg="http://schemas.microsoft.com/office/word/2010/wordprocessingGroup" xmlns:wpi="http://schemas.microsoft.com/office/word/2010/wordprocessingInk" xmlns:wne="http://schemas.microsoft.com/office/word/2006/wordml" xmlns:wps="http://schemas.microsoft.com/office/word/2010/wordprocessingShape" mc:Ignorable="w14 w15 w16se w16cid w16 w16cex w16sdtdh w16sdtfl w16du wp14">
   <w:endnote w:type="separator" w:id="-1">
     <w:p>
       <w:pPr>
@@ -11335,7 +11306,7 @@
 </file>
 
 <file path=word/footer1.xml><?xml version="1.0" encoding="utf-8"?>
-<w:ftr xmlns:wpc="http://schemas.microsoft.com/office/word/2010/wordprocessingCanvas" xmlns:cx="http://schemas.microsoft.com/office/drawing/2014/chartex" xmlns:cx1="http://schemas.microsoft.com/office/drawing/2015/9/8/chartex" xmlns:cx2="http://schemas.microsoft.com/office/drawing/2015/10/21/chartex" xmlns:cx3="http://schemas.microsoft.com/office/drawing/2016/5/9/chartex" xmlns:cx4="http://schemas.microsoft.com/office/drawing/2016/5/10/chartex" xmlns:cx5="http://schemas.microsoft.com/office/drawing/2016/5/11/chartex" xmlns:cx6="http://schemas.microsoft.com/office/drawing/2016/5/12/chartex" xmlns:cx7="http://schemas.microsoft.com/office/drawing/2016/5/13/chartex" xmlns:cx8="http://schemas.microsoft.com/office/drawing/2016/5/14/chartex" xmlns:mc="http://schemas.openxmlformats.org/markup-compatibility/2006" xmlns:aink="http://schemas.microsoft.com/office/drawing/2016/ink" xmlns:am3d="http://schemas.microsoft.com/office/drawing/2017/model3d" xmlns:o="urn:schemas-microsoft-com:office:office" xmlns:oel="http://schemas.microsoft.com/office/2019/extlst" xmlns:r="http://schemas.openxmlformats.org/officeDocument/2006/relationships" xmlns:m="http://schemas.openxmlformats.org/officeDocument/2006/math" xmlns:v="urn:schemas-microsoft-com:vml" xmlns:wp14="http://schemas.microsoft.com/office/word/2010/wordprocessingDrawing" xmlns:wp="http://schemas.openxmlformats.org/drawingml/2006/wordprocessingDrawing" xmlns:w10="urn:schemas-microsoft-com:office:word" xmlns:w="http://schemas.openxmlformats.org/wordprocessingml/2006/main" xmlns:w14="http://schemas.microsoft.com/office/word/2010/wordml" xmlns:w15="http://schemas.microsoft.com/office/word/2012/wordml" xmlns:w16cex="http://schemas.microsoft.com/office/word/2018/wordml/cex" xmlns:w16cid="http://schemas.microsoft.com/office/word/2016/wordml/cid" xmlns:w16="http://schemas.microsoft.com/office/word/2018/wordml" xmlns:w16du="http://schemas.microsoft.com/office/word/2023/wordml/word16du" xmlns:w16sdtdh="http://schemas.microsoft.com/office/word/2020/wordml/sdtdatahash" xmlns:w16se="http://schemas.microsoft.com/office/word/2015/wordml/symex" xmlns:wpg="http://schemas.microsoft.com/office/word/2010/wordprocessingGroup" xmlns:wpi="http://schemas.microsoft.com/office/word/2010/wordprocessingInk" xmlns:wne="http://schemas.microsoft.com/office/word/2006/wordml" xmlns:wps="http://schemas.microsoft.com/office/word/2010/wordprocessingShape" mc:Ignorable="w14 w15 w16se w16cid w16 w16cex w16sdtdh w16du wp14">
+<w:ftr xmlns:wpc="http://schemas.microsoft.com/office/word/2010/wordprocessingCanvas" xmlns:cx="http://schemas.microsoft.com/office/drawing/2014/chartex" xmlns:cx1="http://schemas.microsoft.com/office/drawing/2015/9/8/chartex" xmlns:cx2="http://schemas.microsoft.com/office/drawing/2015/10/21/chartex" xmlns:cx3="http://schemas.microsoft.com/office/drawing/2016/5/9/chartex" xmlns:cx4="http://schemas.microsoft.com/office/drawing/2016/5/10/chartex" xmlns:cx5="http://schemas.microsoft.com/office/drawing/2016/5/11/chartex" xmlns:cx6="http://schemas.microsoft.com/office/drawing/2016/5/12/chartex" xmlns:cx7="http://schemas.microsoft.com/office/drawing/2016/5/13/chartex" xmlns:cx8="http://schemas.microsoft.com/office/drawing/2016/5/14/chartex" xmlns:mc="http://schemas.openxmlformats.org/markup-compatibility/2006" xmlns:aink="http://schemas.microsoft.com/office/drawing/2016/ink" xmlns:am3d="http://schemas.microsoft.com/office/drawing/2017/model3d" xmlns:o="urn:schemas-microsoft-com:office:office" xmlns:oel="http://schemas.microsoft.com/office/2019/extlst" xmlns:r="http://schemas.openxmlformats.org/officeDocument/2006/relationships" xmlns:m="http://schemas.openxmlformats.org/officeDocument/2006/math" xmlns:v="urn:schemas-microsoft-com:vml" xmlns:wp14="http://schemas.microsoft.com/office/word/2010/wordprocessingDrawing" xmlns:wp="http://schemas.openxmlformats.org/drawingml/2006/wordprocessingDrawing" xmlns:w10="urn:schemas-microsoft-com:office:word" xmlns:w="http://schemas.openxmlformats.org/wordprocessingml/2006/main" xmlns:w14="http://schemas.microsoft.com/office/word/2010/wordml" xmlns:w15="http://schemas.microsoft.com/office/word/2012/wordml" xmlns:w16cex="http://schemas.microsoft.com/office/word/2018/wordml/cex" xmlns:w16cid="http://schemas.microsoft.com/office/word/2016/wordml/cid" xmlns:w16="http://schemas.microsoft.com/office/word/2018/wordml" xmlns:w16du="http://schemas.microsoft.com/office/word/2023/wordml/word16du" xmlns:w16sdtdh="http://schemas.microsoft.com/office/word/2020/wordml/sdtdatahash" xmlns:w16sdtfl="http://schemas.microsoft.com/office/word/2024/wordml/sdtformatlock" xmlns:w16se="http://schemas.microsoft.com/office/word/2015/wordml/symex" xmlns:wpg="http://schemas.microsoft.com/office/word/2010/wordprocessingGroup" xmlns:wpi="http://schemas.microsoft.com/office/word/2010/wordprocessingInk" xmlns:wne="http://schemas.microsoft.com/office/word/2006/wordml" xmlns:wps="http://schemas.microsoft.com/office/word/2010/wordprocessingShape" mc:Ignorable="w14 w15 w16se w16cid w16 w16cex w16sdtdh w16sdtfl w16du wp14">
   <w:sdt>
     <w:sdtPr>
       <w:id w:val="1278296352"/>
@@ -11388,7 +11359,7 @@
 </file>
 
 <file path=word/footer2.xml><?xml version="1.0" encoding="utf-8"?>
-<w:ftr xmlns:wpc="http://schemas.microsoft.com/office/word/2010/wordprocessingCanvas" xmlns:cx="http://schemas.microsoft.com/office/drawing/2014/chartex" xmlns:cx1="http://schemas.microsoft.com/office/drawing/2015/9/8/chartex" xmlns:cx2="http://schemas.microsoft.com/office/drawing/2015/10/21/chartex" xmlns:cx3="http://schemas.microsoft.com/office/drawing/2016/5/9/chartex" xmlns:cx4="http://schemas.microsoft.com/office/drawing/2016/5/10/chartex" xmlns:cx5="http://schemas.microsoft.com/office/drawing/2016/5/11/chartex" xmlns:cx6="http://schemas.microsoft.com/office/drawing/2016/5/12/chartex" xmlns:cx7="http://schemas.microsoft.com/office/drawing/2016/5/13/chartex" xmlns:cx8="http://schemas.microsoft.com/office/drawing/2016/5/14/chartex" xmlns:mc="http://schemas.openxmlformats.org/markup-compatibility/2006" xmlns:aink="http://schemas.microsoft.com/office/drawing/2016/ink" xmlns:am3d="http://schemas.microsoft.com/office/drawing/2017/model3d" xmlns:o="urn:schemas-microsoft-com:office:office" xmlns:oel="http://schemas.microsoft.com/office/2019/extlst" xmlns:r="http://schemas.openxmlformats.org/officeDocument/2006/relationships" xmlns:m="http://schemas.openxmlformats.org/officeDocument/2006/math" xmlns:v="urn:schemas-microsoft-com:vml" xmlns:wp14="http://schemas.microsoft.com/office/word/2010/wordprocessingDrawing" xmlns:wp="http://schemas.openxmlformats.org/drawingml/2006/wordprocessingDrawing" xmlns:w10="urn:schemas-microsoft-com:office:word" xmlns:w="http://schemas.openxmlformats.org/wordprocessingml/2006/main" xmlns:w14="http://schemas.microsoft.com/office/word/2010/wordml" xmlns:w15="http://schemas.microsoft.com/office/word/2012/wordml" xmlns:w16cex="http://schemas.microsoft.com/office/word/2018/wordml/cex" xmlns:w16cid="http://schemas.microsoft.com/office/word/2016/wordml/cid" xmlns:w16="http://schemas.microsoft.com/office/word/2018/wordml" xmlns:w16du="http://schemas.microsoft.com/office/word/2023/wordml/word16du" xmlns:w16sdtdh="http://schemas.microsoft.com/office/word/2020/wordml/sdtdatahash" xmlns:w16se="http://schemas.microsoft.com/office/word/2015/wordml/symex" xmlns:wpg="http://schemas.microsoft.com/office/word/2010/wordprocessingGroup" xmlns:wpi="http://schemas.microsoft.com/office/word/2010/wordprocessingInk" xmlns:wne="http://schemas.microsoft.com/office/word/2006/wordml" xmlns:wps="http://schemas.microsoft.com/office/word/2010/wordprocessingShape" mc:Ignorable="w14 w15 w16se w16cid w16 w16cex w16sdtdh w16du wp14">
+<w:ftr xmlns:wpc="http://schemas.microsoft.com/office/word/2010/wordprocessingCanvas" xmlns:cx="http://schemas.microsoft.com/office/drawing/2014/chartex" xmlns:cx1="http://schemas.microsoft.com/office/drawing/2015/9/8/chartex" xmlns:cx2="http://schemas.microsoft.com/office/drawing/2015/10/21/chartex" xmlns:cx3="http://schemas.microsoft.com/office/drawing/2016/5/9/chartex" xmlns:cx4="http://schemas.microsoft.com/office/drawing/2016/5/10/chartex" xmlns:cx5="http://schemas.microsoft.com/office/drawing/2016/5/11/chartex" xmlns:cx6="http://schemas.microsoft.com/office/drawing/2016/5/12/chartex" xmlns:cx7="http://schemas.microsoft.com/office/drawing/2016/5/13/chartex" xmlns:cx8="http://schemas.microsoft.com/office/drawing/2016/5/14/chartex" xmlns:mc="http://schemas.openxmlformats.org/markup-compatibility/2006" xmlns:aink="http://schemas.microsoft.com/office/drawing/2016/ink" xmlns:am3d="http://schemas.microsoft.com/office/drawing/2017/model3d" xmlns:o="urn:schemas-microsoft-com:office:office" xmlns:oel="http://schemas.microsoft.com/office/2019/extlst" xmlns:r="http://schemas.openxmlformats.org/officeDocument/2006/relationships" xmlns:m="http://schemas.openxmlformats.org/officeDocument/2006/math" xmlns:v="urn:schemas-microsoft-com:vml" xmlns:wp14="http://schemas.microsoft.com/office/word/2010/wordprocessingDrawing" xmlns:wp="http://schemas.openxmlformats.org/drawingml/2006/wordprocessingDrawing" xmlns:w10="urn:schemas-microsoft-com:office:word" xmlns:w="http://schemas.openxmlformats.org/wordprocessingml/2006/main" xmlns:w14="http://schemas.microsoft.com/office/word/2010/wordml" xmlns:w15="http://schemas.microsoft.com/office/word/2012/wordml" xmlns:w16cex="http://schemas.microsoft.com/office/word/2018/wordml/cex" xmlns:w16cid="http://schemas.microsoft.com/office/word/2016/wordml/cid" xmlns:w16="http://schemas.microsoft.com/office/word/2018/wordml" xmlns:w16du="http://schemas.microsoft.com/office/word/2023/wordml/word16du" xmlns:w16sdtdh="http://schemas.microsoft.com/office/word/2020/wordml/sdtdatahash" xmlns:w16sdtfl="http://schemas.microsoft.com/office/word/2024/wordml/sdtformatlock" xmlns:w16se="http://schemas.microsoft.com/office/word/2015/wordml/symex" xmlns:wpg="http://schemas.microsoft.com/office/word/2010/wordprocessingGroup" xmlns:wpi="http://schemas.microsoft.com/office/word/2010/wordprocessingInk" xmlns:wne="http://schemas.microsoft.com/office/word/2006/wordml" xmlns:wps="http://schemas.microsoft.com/office/word/2010/wordprocessingShape" mc:Ignorable="w14 w15 w16se w16cid w16 w16cex w16sdtdh w16sdtfl w16du wp14">
   <w:p>
     <w:pPr>
       <w:pBdr>
@@ -11637,6 +11608,21 @@
         <w:szCs w:val="20"/>
       </w:rPr>
       <w:instrText xml:space="preserve"> CREATEDATE  \@ "d MMMM yyyy"  \* MERGEFORMAT </w:instrText>
+    </w:r>
+    <w:r>
+      <w:rPr>
+        <w:sz w:val="20"/>
+        <w:szCs w:val="20"/>
+      </w:rPr>
+      <w:fldChar w:fldCharType="separate"/>
+    </w:r>
+    <w:r>
+      <w:rPr>
+        <w:noProof/>
+        <w:sz w:val="20"/>
+        <w:szCs w:val="20"/>
+      </w:rPr>
+      <w:t>26 February 2026</w:t>
     </w:r>
     <w:r>
       <w:rPr>
@@ -11671,7 +11657,7 @@
 </file>
 
 <file path=word/footnotes.xml><?xml version="1.0" encoding="utf-8"?>
-<w:footnotes xmlns:wpc="http://schemas.microsoft.com/office/word/2010/wordprocessingCanvas" xmlns:cx="http://schemas.microsoft.com/office/drawing/2014/chartex" xmlns:cx1="http://schemas.microsoft.com/office/drawing/2015/9/8/chartex" xmlns:cx2="http://schemas.microsoft.com/office/drawing/2015/10/21/chartex" xmlns:cx3="http://schemas.microsoft.com/office/drawing/2016/5/9/chartex" xmlns:cx4="http://schemas.microsoft.com/office/drawing/2016/5/10/chartex" xmlns:cx5="http://schemas.microsoft.com/office/drawing/2016/5/11/chartex" xmlns:cx6="http://schemas.microsoft.com/office/drawing/2016/5/12/chartex" xmlns:cx7="http://schemas.microsoft.com/office/drawing/2016/5/13/chartex" xmlns:cx8="http://schemas.microsoft.com/office/drawing/2016/5/14/chartex" xmlns:mc="http://schemas.openxmlformats.org/markup-compatibility/2006" xmlns:aink="http://schemas.microsoft.com/office/drawing/2016/ink" xmlns:am3d="http://schemas.microsoft.com/office/drawing/2017/model3d" xmlns:o="urn:schemas-microsoft-com:office:office" xmlns:oel="http://schemas.microsoft.com/office/2019/extlst" xmlns:r="http://schemas.openxmlformats.org/officeDocument/2006/relationships" xmlns:m="http://schemas.openxmlformats.org/officeDocument/2006/math" xmlns:v="urn:schemas-microsoft-com:vml" xmlns:wp14="http://schemas.microsoft.com/office/word/2010/wordprocessingDrawing" xmlns:wp="http://schemas.openxmlformats.org/drawingml/2006/wordprocessingDrawing" xmlns:w10="urn:schemas-microsoft-com:office:word" xmlns:w="http://schemas.openxmlformats.org/wordprocessingml/2006/main" xmlns:w14="http://schemas.microsoft.com/office/word/2010/wordml" xmlns:w15="http://schemas.microsoft.com/office/word/2012/wordml" xmlns:w16cex="http://schemas.microsoft.com/office/word/2018/wordml/cex" xmlns:w16cid="http://schemas.microsoft.com/office/word/2016/wordml/cid" xmlns:w16="http://schemas.microsoft.com/office/word/2018/wordml" xmlns:w16du="http://schemas.microsoft.com/office/word/2023/wordml/word16du" xmlns:w16sdtdh="http://schemas.microsoft.com/office/word/2020/wordml/sdtdatahash" xmlns:w16se="http://schemas.microsoft.com/office/word/2015/wordml/symex" xmlns:wpg="http://schemas.microsoft.com/office/word/2010/wordprocessingGroup" xmlns:wpi="http://schemas.microsoft.com/office/word/2010/wordprocessingInk" xmlns:wne="http://schemas.microsoft.com/office/word/2006/wordml" xmlns:wps="http://schemas.microsoft.com/office/word/2010/wordprocessingShape" mc:Ignorable="w14 w15 w16se w16cid w16 w16cex w16sdtdh w16du wp14">
+<w:footnotes xmlns:wpc="http://schemas.microsoft.com/office/word/2010/wordprocessingCanvas" xmlns:cx="http://schemas.microsoft.com/office/drawing/2014/chartex" xmlns:cx1="http://schemas.microsoft.com/office/drawing/2015/9/8/chartex" xmlns:cx2="http://schemas.microsoft.com/office/drawing/2015/10/21/chartex" xmlns:cx3="http://schemas.microsoft.com/office/drawing/2016/5/9/chartex" xmlns:cx4="http://schemas.microsoft.com/office/drawing/2016/5/10/chartex" xmlns:cx5="http://schemas.microsoft.com/office/drawing/2016/5/11/chartex" xmlns:cx6="http://schemas.microsoft.com/office/drawing/2016/5/12/chartex" xmlns:cx7="http://schemas.microsoft.com/office/drawing/2016/5/13/chartex" xmlns:cx8="http://schemas.microsoft.com/office/drawing/2016/5/14/chartex" xmlns:mc="http://schemas.openxmlformats.org/markup-compatibility/2006" xmlns:aink="http://schemas.microsoft.com/office/drawing/2016/ink" xmlns:am3d="http://schemas.microsoft.com/office/drawing/2017/model3d" xmlns:o="urn:schemas-microsoft-com:office:office" xmlns:oel="http://schemas.microsoft.com/office/2019/extlst" xmlns:r="http://schemas.openxmlformats.org/officeDocument/2006/relationships" xmlns:m="http://schemas.openxmlformats.org/officeDocument/2006/math" xmlns:v="urn:schemas-microsoft-com:vml" xmlns:wp14="http://schemas.microsoft.com/office/word/2010/wordprocessingDrawing" xmlns:wp="http://schemas.openxmlformats.org/drawingml/2006/wordprocessingDrawing" xmlns:w10="urn:schemas-microsoft-com:office:word" xmlns:w="http://schemas.openxmlformats.org/wordprocessingml/2006/main" xmlns:w14="http://schemas.microsoft.com/office/word/2010/wordml" xmlns:w15="http://schemas.microsoft.com/office/word/2012/wordml" xmlns:w16cex="http://schemas.microsoft.com/office/word/2018/wordml/cex" xmlns:w16cid="http://schemas.microsoft.com/office/word/2016/wordml/cid" xmlns:w16="http://schemas.microsoft.com/office/word/2018/wordml" xmlns:w16du="http://schemas.microsoft.com/office/word/2023/wordml/word16du" xmlns:w16sdtdh="http://schemas.microsoft.com/office/word/2020/wordml/sdtdatahash" xmlns:w16sdtfl="http://schemas.microsoft.com/office/word/2024/wordml/sdtformatlock" xmlns:w16se="http://schemas.microsoft.com/office/word/2015/wordml/symex" xmlns:wpg="http://schemas.microsoft.com/office/word/2010/wordprocessingGroup" xmlns:wpi="http://schemas.microsoft.com/office/word/2010/wordprocessingInk" xmlns:wne="http://schemas.microsoft.com/office/word/2006/wordml" xmlns:wps="http://schemas.microsoft.com/office/word/2010/wordprocessingShape" mc:Ignorable="w14 w15 w16se w16cid w16 w16cex w16sdtdh w16sdtfl w16du wp14">
   <w:footnote w:type="separator" w:id="-1">
     <w:p>
       <w:pPr>
@@ -11696,7 +11682,7 @@
 </file>
 
 <file path=word/header1.xml><?xml version="1.0" encoding="utf-8"?>
-<w:hdr xmlns:wpc="http://schemas.microsoft.com/office/word/2010/wordprocessingCanvas" xmlns:cx="http://schemas.microsoft.com/office/drawing/2014/chartex" xmlns:cx1="http://schemas.microsoft.com/office/drawing/2015/9/8/chartex" xmlns:cx2="http://schemas.microsoft.com/office/drawing/2015/10/21/chartex" xmlns:cx3="http://schemas.microsoft.com/office/drawing/2016/5/9/chartex" xmlns:cx4="http://schemas.microsoft.com/office/drawing/2016/5/10/chartex" xmlns:cx5="http://schemas.microsoft.com/office/drawing/2016/5/11/chartex" xmlns:cx6="http://schemas.microsoft.com/office/drawing/2016/5/12/chartex" xmlns:cx7="http://schemas.microsoft.com/office/drawing/2016/5/13/chartex" xmlns:cx8="http://schemas.microsoft.com/office/drawing/2016/5/14/chartex" xmlns:mc="http://schemas.openxmlformats.org/markup-compatibility/2006" xmlns:aink="http://schemas.microsoft.com/office/drawing/2016/ink" xmlns:am3d="http://schemas.microsoft.com/office/drawing/2017/model3d" xmlns:o="urn:schemas-microsoft-com:office:office" xmlns:oel="http://schemas.microsoft.com/office/2019/extlst" xmlns:r="http://schemas.openxmlformats.org/officeDocument/2006/relationships" xmlns:m="http://schemas.openxmlformats.org/officeDocument/2006/math" xmlns:v="urn:schemas-microsoft-com:vml" xmlns:wp14="http://schemas.microsoft.com/office/word/2010/wordprocessingDrawing" xmlns:wp="http://schemas.openxmlformats.org/drawingml/2006/wordprocessingDrawing" xmlns:w10="urn:schemas-microsoft-com:office:word" xmlns:w="http://schemas.openxmlformats.org/wordprocessingml/2006/main" xmlns:w14="http://schemas.microsoft.com/office/word/2010/wordml" xmlns:w15="http://schemas.microsoft.com/office/word/2012/wordml" xmlns:w16cex="http://schemas.microsoft.com/office/word/2018/wordml/cex" xmlns:w16cid="http://schemas.microsoft.com/office/word/2016/wordml/cid" xmlns:w16="http://schemas.microsoft.com/office/word/2018/wordml" xmlns:w16du="http://schemas.microsoft.com/office/word/2023/wordml/word16du" xmlns:w16sdtdh="http://schemas.microsoft.com/office/word/2020/wordml/sdtdatahash" xmlns:w16se="http://schemas.microsoft.com/office/word/2015/wordml/symex" xmlns:wpg="http://schemas.microsoft.com/office/word/2010/wordprocessingGroup" xmlns:wpi="http://schemas.microsoft.com/office/word/2010/wordprocessingInk" xmlns:wne="http://schemas.microsoft.com/office/word/2006/wordml" xmlns:wps="http://schemas.microsoft.com/office/word/2010/wordprocessingShape" mc:Ignorable="w14 w15 w16se w16cid w16 w16cex w16sdtdh w16du wp14">
+<w:hdr xmlns:wpc="http://schemas.microsoft.com/office/word/2010/wordprocessingCanvas" xmlns:cx="http://schemas.microsoft.com/office/drawing/2014/chartex" xmlns:cx1="http://schemas.microsoft.com/office/drawing/2015/9/8/chartex" xmlns:cx2="http://schemas.microsoft.com/office/drawing/2015/10/21/chartex" xmlns:cx3="http://schemas.microsoft.com/office/drawing/2016/5/9/chartex" xmlns:cx4="http://schemas.microsoft.com/office/drawing/2016/5/10/chartex" xmlns:cx5="http://schemas.microsoft.com/office/drawing/2016/5/11/chartex" xmlns:cx6="http://schemas.microsoft.com/office/drawing/2016/5/12/chartex" xmlns:cx7="http://schemas.microsoft.com/office/drawing/2016/5/13/chartex" xmlns:cx8="http://schemas.microsoft.com/office/drawing/2016/5/14/chartex" xmlns:mc="http://schemas.openxmlformats.org/markup-compatibility/2006" xmlns:aink="http://schemas.microsoft.com/office/drawing/2016/ink" xmlns:am3d="http://schemas.microsoft.com/office/drawing/2017/model3d" xmlns:o="urn:schemas-microsoft-com:office:office" xmlns:oel="http://schemas.microsoft.com/office/2019/extlst" xmlns:r="http://schemas.openxmlformats.org/officeDocument/2006/relationships" xmlns:m="http://schemas.openxmlformats.org/officeDocument/2006/math" xmlns:v="urn:schemas-microsoft-com:vml" xmlns:wp14="http://schemas.microsoft.com/office/word/2010/wordprocessingDrawing" xmlns:wp="http://schemas.openxmlformats.org/drawingml/2006/wordprocessingDrawing" xmlns:w10="urn:schemas-microsoft-com:office:word" xmlns:w="http://schemas.openxmlformats.org/wordprocessingml/2006/main" xmlns:w14="http://schemas.microsoft.com/office/word/2010/wordml" xmlns:w15="http://schemas.microsoft.com/office/word/2012/wordml" xmlns:w16cex="http://schemas.microsoft.com/office/word/2018/wordml/cex" xmlns:w16cid="http://schemas.microsoft.com/office/word/2016/wordml/cid" xmlns:w16="http://schemas.microsoft.com/office/word/2018/wordml" xmlns:w16du="http://schemas.microsoft.com/office/word/2023/wordml/word16du" xmlns:w16sdtdh="http://schemas.microsoft.com/office/word/2020/wordml/sdtdatahash" xmlns:w16sdtfl="http://schemas.microsoft.com/office/word/2024/wordml/sdtformatlock" xmlns:w16se="http://schemas.microsoft.com/office/word/2015/wordml/symex" xmlns:wpg="http://schemas.microsoft.com/office/word/2010/wordprocessingGroup" xmlns:wpi="http://schemas.microsoft.com/office/word/2010/wordprocessingInk" xmlns:wne="http://schemas.microsoft.com/office/word/2006/wordml" xmlns:wps="http://schemas.microsoft.com/office/word/2010/wordprocessingShape" mc:Ignorable="w14 w15 w16se w16cid w16 w16cex w16sdtdh w16sdtfl w16du wp14">
   <w:p>
     <w:pPr>
       <w:pStyle w:val="Header"/>
@@ -11948,7 +11934,7 @@
 </file>
 
 <file path=word/numbering.xml><?xml version="1.0" encoding="utf-8"?>
-<w:numbering xmlns:wpc="http://schemas.microsoft.com/office/word/2010/wordprocessingCanvas" xmlns:cx="http://schemas.microsoft.com/office/drawing/2014/chartex" xmlns:cx1="http://schemas.microsoft.com/office/drawing/2015/9/8/chartex" xmlns:cx2="http://schemas.microsoft.com/office/drawing/2015/10/21/chartex" xmlns:cx3="http://schemas.microsoft.com/office/drawing/2016/5/9/chartex" xmlns:cx4="http://schemas.microsoft.com/office/drawing/2016/5/10/chartex" xmlns:cx5="http://schemas.microsoft.com/office/drawing/2016/5/11/chartex" xmlns:cx6="http://schemas.microsoft.com/office/drawing/2016/5/12/chartex" xmlns:cx7="http://schemas.microsoft.com/office/drawing/2016/5/13/chartex" xmlns:cx8="http://schemas.microsoft.com/office/drawing/2016/5/14/chartex" xmlns:mc="http://schemas.openxmlformats.org/markup-compatibility/2006" xmlns:aink="http://schemas.microsoft.com/office/drawing/2016/ink" xmlns:am3d="http://schemas.microsoft.com/office/drawing/2017/model3d" xmlns:o="urn:schemas-microsoft-com:office:office" xmlns:oel="http://schemas.microsoft.com/office/2019/extlst" xmlns:r="http://schemas.openxmlformats.org/officeDocument/2006/relationships" xmlns:m="http://schemas.openxmlformats.org/officeDocument/2006/math" xmlns:v="urn:schemas-microsoft-com:vml" xmlns:wp14="http://schemas.microsoft.com/office/word/2010/wordprocessingDrawing" xmlns:wp="http://schemas.openxmlformats.org/drawingml/2006/wordprocessingDrawing" xmlns:w10="urn:schemas-microsoft-com:office:word" xmlns:w="http://schemas.openxmlformats.org/wordprocessingml/2006/main" xmlns:w14="http://schemas.microsoft.com/office/word/2010/wordml" xmlns:w15="http://schemas.microsoft.com/office/word/2012/wordml" xmlns:w16cex="http://schemas.microsoft.com/office/word/2018/wordml/cex" xmlns:w16cid="http://schemas.microsoft.com/office/word/2016/wordml/cid" xmlns:w16="http://schemas.microsoft.com/office/word/2018/wordml" xmlns:w16du="http://schemas.microsoft.com/office/word/2023/wordml/word16du" xmlns:w16sdtdh="http://schemas.microsoft.com/office/word/2020/wordml/sdtdatahash" xmlns:w16se="http://schemas.microsoft.com/office/word/2015/wordml/symex" xmlns:wpg="http://schemas.microsoft.com/office/word/2010/wordprocessingGroup" xmlns:wpi="http://schemas.microsoft.com/office/word/2010/wordprocessingInk" xmlns:wne="http://schemas.microsoft.com/office/word/2006/wordml" xmlns:wps="http://schemas.microsoft.com/office/word/2010/wordprocessingShape" mc:Ignorable="w14 w15 w16se w16cid w16 w16cex w16sdtdh w16du wp14">
+<w:numbering xmlns:wpc="http://schemas.microsoft.com/office/word/2010/wordprocessingCanvas" xmlns:cx="http://schemas.microsoft.com/office/drawing/2014/chartex" xmlns:cx1="http://schemas.microsoft.com/office/drawing/2015/9/8/chartex" xmlns:cx2="http://schemas.microsoft.com/office/drawing/2015/10/21/chartex" xmlns:cx3="http://schemas.microsoft.com/office/drawing/2016/5/9/chartex" xmlns:cx4="http://schemas.microsoft.com/office/drawing/2016/5/10/chartex" xmlns:cx5="http://schemas.microsoft.com/office/drawing/2016/5/11/chartex" xmlns:cx6="http://schemas.microsoft.com/office/drawing/2016/5/12/chartex" xmlns:cx7="http://schemas.microsoft.com/office/drawing/2016/5/13/chartex" xmlns:cx8="http://schemas.microsoft.com/office/drawing/2016/5/14/chartex" xmlns:mc="http://schemas.openxmlformats.org/markup-compatibility/2006" xmlns:aink="http://schemas.microsoft.com/office/drawing/2016/ink" xmlns:am3d="http://schemas.microsoft.com/office/drawing/2017/model3d" xmlns:o="urn:schemas-microsoft-com:office:office" xmlns:oel="http://schemas.microsoft.com/office/2019/extlst" xmlns:r="http://schemas.openxmlformats.org/officeDocument/2006/relationships" xmlns:m="http://schemas.openxmlformats.org/officeDocument/2006/math" xmlns:v="urn:schemas-microsoft-com:vml" xmlns:wp14="http://schemas.microsoft.com/office/word/2010/wordprocessingDrawing" xmlns:wp="http://schemas.openxmlformats.org/drawingml/2006/wordprocessingDrawing" xmlns:w10="urn:schemas-microsoft-com:office:word" xmlns:w="http://schemas.openxmlformats.org/wordprocessingml/2006/main" xmlns:w14="http://schemas.microsoft.com/office/word/2010/wordml" xmlns:w15="http://schemas.microsoft.com/office/word/2012/wordml" xmlns:w16cex="http://schemas.microsoft.com/office/word/2018/wordml/cex" xmlns:w16cid="http://schemas.microsoft.com/office/word/2016/wordml/cid" xmlns:w16="http://schemas.microsoft.com/office/word/2018/wordml" xmlns:w16du="http://schemas.microsoft.com/office/word/2023/wordml/word16du" xmlns:w16sdtdh="http://schemas.microsoft.com/office/word/2020/wordml/sdtdatahash" xmlns:w16sdtfl="http://schemas.microsoft.com/office/word/2024/wordml/sdtformatlock" xmlns:w16se="http://schemas.microsoft.com/office/word/2015/wordml/symex" xmlns:wpg="http://schemas.microsoft.com/office/word/2010/wordprocessingGroup" xmlns:wpi="http://schemas.microsoft.com/office/word/2010/wordprocessingInk" xmlns:wne="http://schemas.microsoft.com/office/word/2006/wordml" xmlns:wps="http://schemas.microsoft.com/office/word/2010/wordprocessingShape" mc:Ignorable="w14 w15 w16se w16cid w16 w16cex w16sdtdh w16sdtfl w16du wp14">
   <w:abstractNum w:abstractNumId="0" w15:restartNumberingAfterBreak="0">
     <w:nsid w:val="0000A990"/>
     <w:multiLevelType w:val="multilevel"/>
@@ -25187,7 +25173,7 @@
 </file>
 
 <file path=word/styles.xml><?xml version="1.0" encoding="utf-8"?>
-<w:styles xmlns:mc="http://schemas.openxmlformats.org/markup-compatibility/2006" xmlns:r="http://schemas.openxmlformats.org/officeDocument/2006/relationships" xmlns:w="http://schemas.openxmlformats.org/wordprocessingml/2006/main" xmlns:w14="http://schemas.microsoft.com/office/word/2010/wordml" xmlns:w15="http://schemas.microsoft.com/office/word/2012/wordml" xmlns:w16cex="http://schemas.microsoft.com/office/word/2018/wordml/cex" xmlns:w16cid="http://schemas.microsoft.com/office/word/2016/wordml/cid" xmlns:w16="http://schemas.microsoft.com/office/word/2018/wordml" xmlns:w16du="http://schemas.microsoft.com/office/word/2023/wordml/word16du" xmlns:w16sdtdh="http://schemas.microsoft.com/office/word/2020/wordml/sdtdatahash" xmlns:w16se="http://schemas.microsoft.com/office/word/2015/wordml/symex" mc:Ignorable="w14 w15 w16se w16cid w16 w16cex w16sdtdh w16du">
+<w:styles xmlns:mc="http://schemas.openxmlformats.org/markup-compatibility/2006" xmlns:r="http://schemas.openxmlformats.org/officeDocument/2006/relationships" xmlns:w="http://schemas.openxmlformats.org/wordprocessingml/2006/main" xmlns:w14="http://schemas.microsoft.com/office/word/2010/wordml" xmlns:w15="http://schemas.microsoft.com/office/word/2012/wordml" xmlns:w16cex="http://schemas.microsoft.com/office/word/2018/wordml/cex" xmlns:w16cid="http://schemas.microsoft.com/office/word/2016/wordml/cid" xmlns:w16="http://schemas.microsoft.com/office/word/2018/wordml" xmlns:w16du="http://schemas.microsoft.com/office/word/2023/wordml/word16du" xmlns:w16sdtdh="http://schemas.microsoft.com/office/word/2020/wordml/sdtdatahash" xmlns:w16sdtfl="http://schemas.microsoft.com/office/word/2024/wordml/sdtformatlock" xmlns:w16se="http://schemas.microsoft.com/office/word/2015/wordml/symex" mc:Ignorable="w14 w15 w16se w16cid w16 w16cex w16sdtdh w16sdtfl w16du">
   <w:docDefaults>
     <w:rPrDefault>
       <w:rPr>

</xml_diff>